<commit_message>
Add OCI to Azure terminology crosswalk
</commit_message>
<xml_diff>
--- a/Azure_OCI_to_Azure_POC_Migration_Plan_and_Timeline.docx
+++ b/Azure_OCI_to_Azure_POC_Migration_Plan_and_Timeline.docx
@@ -968,6 +968,2692 @@
       </w:pPr>
       <w:r>
         <w:t>The OCI A10.2 name cannot be retained in Azure because it is an OCI VM shape. The Azure POC must select an Azure A10 SKU that meets the same functional requirement and is available in the approved government region.</w:t>
+      </w:r>
+    </w:p>
+    <w:p>
+      <w:r>
+        <w:br w:type="page"/>
+      </w:r>
+    </w:p>
+    <w:p>
+      <w:pPr>
+        <w:pStyle w:val="Heading1"/>
+      </w:pPr>
+      <w:r>
+        <w:t>OCI to Azure Terminology Crosswalk</w:t>
+      </w:r>
+    </w:p>
+    <w:p>
+      <w:r>
+        <w:t>Use the Azure term when describing the target design. The entries marked as approximate require a design decision because the OCI and Azure services do not have identical boundaries or behavior.</w:t>
+      </w:r>
+    </w:p>
+    <w:p>
+      <w:pPr>
+        <w:pStyle w:val="Heading2"/>
+      </w:pPr>
+      <w:r>
+        <w:t>Organization and Networking</w:t>
+      </w:r>
+    </w:p>
+    <w:tbl>
+      <w:tblPr>
+        <w:tblW w:type="auto" w:w="0"/>
+        <w:jc w:val="center"/>
+        <w:tblLayout w:type="fixed"/>
+        <w:tblLook w:firstColumn="1" w:firstRow="1" w:lastColumn="0" w:lastRow="0" w:noHBand="0" w:noVBand="1" w:val="04A0"/>
+        <w:tblBorders>
+          <w:top w:val="single" w:sz="4" w:color="D9D9D9"/>
+          <w:left w:val="single" w:sz="4" w:color="D9D9D9"/>
+          <w:bottom w:val="single" w:sz="4" w:color="D9D9D9"/>
+          <w:right w:val="single" w:sz="4" w:color="D9D9D9"/>
+          <w:insideH w:val="single" w:sz="4" w:color="D9D9D9"/>
+          <w:insideV w:val="single" w:sz="4" w:color="D9D9D9"/>
+        </w:tblBorders>
+      </w:tblPr>
+      <w:tblGrid>
+        <w:gridCol w:w="2664"/>
+        <w:gridCol w:w="2952"/>
+        <w:gridCol w:w="4464"/>
+      </w:tblGrid>
+      <w:tr>
+        <w:trPr>
+          <w:cantSplit/>
+          <w:tblHeader/>
+        </w:trPr>
+        <w:tc>
+          <w:tcPr>
+            <w:tcW w:type="dxa" w:w="2664"/>
+            <w:vAlign w:val="center"/>
+            <w:tcMar>
+              <w:top w:w="100" w:type="dxa"/>
+              <w:bottom w:w="100" w:type="dxa"/>
+              <w:left w:w="100" w:type="dxa"/>
+              <w:right w:w="100" w:type="dxa"/>
+            </w:tcMar>
+            <w:shd w:fill="203864"/>
+          </w:tcPr>
+          <w:p>
+            <w:pPr>
+              <w:spacing w:after="0" w:line="245" w:lineRule="auto"/>
+            </w:pPr>
+            <w:r>
+              <w:rPr>
+                <w:b/>
+                <w:color w:val="FFFFFF"/>
+                <w:sz w:val="16"/>
+              </w:rPr>
+              <w:t>OCI term</w:t>
+            </w:r>
+          </w:p>
+        </w:tc>
+        <w:tc>
+          <w:tcPr>
+            <w:tcW w:type="dxa" w:w="2952"/>
+            <w:vAlign w:val="center"/>
+            <w:tcMar>
+              <w:top w:w="100" w:type="dxa"/>
+              <w:bottom w:w="100" w:type="dxa"/>
+              <w:left w:w="100" w:type="dxa"/>
+              <w:right w:w="100" w:type="dxa"/>
+            </w:tcMar>
+            <w:shd w:fill="203864"/>
+          </w:tcPr>
+          <w:p>
+            <w:pPr>
+              <w:spacing w:after="0" w:line="245" w:lineRule="auto"/>
+            </w:pPr>
+            <w:r>
+              <w:rPr>
+                <w:b/>
+                <w:color w:val="FFFFFF"/>
+                <w:sz w:val="16"/>
+              </w:rPr>
+              <w:t>Azure term</w:t>
+            </w:r>
+          </w:p>
+        </w:tc>
+        <w:tc>
+          <w:tcPr>
+            <w:tcW w:type="dxa" w:w="4464"/>
+            <w:vAlign w:val="center"/>
+            <w:tcMar>
+              <w:top w:w="100" w:type="dxa"/>
+              <w:bottom w:w="100" w:type="dxa"/>
+              <w:left w:w="100" w:type="dxa"/>
+              <w:right w:w="100" w:type="dxa"/>
+            </w:tcMar>
+            <w:shd w:fill="203864"/>
+          </w:tcPr>
+          <w:p>
+            <w:pPr>
+              <w:spacing w:after="0" w:line="245" w:lineRule="auto"/>
+            </w:pPr>
+            <w:r>
+              <w:rPr>
+                <w:b/>
+                <w:color w:val="FFFFFF"/>
+                <w:sz w:val="16"/>
+              </w:rPr>
+              <w:t>POC interpretation</w:t>
+            </w:r>
+          </w:p>
+        </w:tc>
+      </w:tr>
+      <w:tr>
+        <w:trPr>
+          <w:cantSplit/>
+        </w:trPr>
+        <w:tc>
+          <w:tcPr>
+            <w:tcW w:type="dxa" w:w="2664"/>
+            <w:vAlign w:val="center"/>
+            <w:tcMar>
+              <w:top w:w="100" w:type="dxa"/>
+              <w:bottom w:w="100" w:type="dxa"/>
+              <w:left w:w="100" w:type="dxa"/>
+              <w:right w:w="100" w:type="dxa"/>
+            </w:tcMar>
+            <w:shd w:fill="FFFFFF"/>
+          </w:tcPr>
+          <w:p>
+            <w:pPr>
+              <w:spacing w:after="0" w:line="245" w:lineRule="auto"/>
+            </w:pPr>
+            <w:r>
+              <w:rPr>
+                <w:b w:val="0"/>
+                <w:color w:val="000000"/>
+                <w:sz w:val="16"/>
+              </w:rPr>
+              <w:t>Tenancy</w:t>
+            </w:r>
+          </w:p>
+        </w:tc>
+        <w:tc>
+          <w:tcPr>
+            <w:tcW w:type="dxa" w:w="2952"/>
+            <w:vAlign w:val="center"/>
+            <w:tcMar>
+              <w:top w:w="100" w:type="dxa"/>
+              <w:bottom w:w="100" w:type="dxa"/>
+              <w:left w:w="100" w:type="dxa"/>
+              <w:right w:w="100" w:type="dxa"/>
+            </w:tcMar>
+            <w:shd w:fill="FFFFFF"/>
+          </w:tcPr>
+          <w:p>
+            <w:pPr>
+              <w:spacing w:after="0" w:line="245" w:lineRule="auto"/>
+            </w:pPr>
+            <w:r>
+              <w:rPr>
+                <w:b w:val="0"/>
+                <w:color w:val="000000"/>
+                <w:sz w:val="16"/>
+              </w:rPr>
+              <w:t>Microsoft Entra tenant plus Azure hierarchy</w:t>
+            </w:r>
+          </w:p>
+        </w:tc>
+        <w:tc>
+          <w:tcPr>
+            <w:tcW w:type="dxa" w:w="4464"/>
+            <w:vAlign w:val="center"/>
+            <w:tcMar>
+              <w:top w:w="100" w:type="dxa"/>
+              <w:bottom w:w="100" w:type="dxa"/>
+              <w:left w:w="100" w:type="dxa"/>
+              <w:right w:w="100" w:type="dxa"/>
+            </w:tcMar>
+            <w:shd w:fill="FFFFFF"/>
+          </w:tcPr>
+          <w:p>
+            <w:pPr>
+              <w:spacing w:after="0" w:line="245" w:lineRule="auto"/>
+            </w:pPr>
+            <w:r>
+              <w:rPr>
+                <w:b w:val="0"/>
+                <w:color w:val="000000"/>
+                <w:sz w:val="16"/>
+              </w:rPr>
+              <w:t>Approximate. Identity, billing and resource governance are separated across the tenant, management groups and subscriptions.</w:t>
+            </w:r>
+          </w:p>
+        </w:tc>
+      </w:tr>
+      <w:tr>
+        <w:trPr>
+          <w:cantSplit/>
+        </w:trPr>
+        <w:tc>
+          <w:tcPr>
+            <w:tcW w:type="dxa" w:w="2664"/>
+            <w:vAlign w:val="center"/>
+            <w:tcMar>
+              <w:top w:w="100" w:type="dxa"/>
+              <w:bottom w:w="100" w:type="dxa"/>
+              <w:left w:w="100" w:type="dxa"/>
+              <w:right w:w="100" w:type="dxa"/>
+            </w:tcMar>
+            <w:shd w:fill="F2F6FA"/>
+          </w:tcPr>
+          <w:p>
+            <w:pPr>
+              <w:spacing w:after="0" w:line="245" w:lineRule="auto"/>
+            </w:pPr>
+            <w:r>
+              <w:rPr>
+                <w:b w:val="0"/>
+                <w:color w:val="000000"/>
+                <w:sz w:val="16"/>
+              </w:rPr>
+              <w:t>Compartment</w:t>
+            </w:r>
+          </w:p>
+        </w:tc>
+        <w:tc>
+          <w:tcPr>
+            <w:tcW w:type="dxa" w:w="2952"/>
+            <w:vAlign w:val="center"/>
+            <w:tcMar>
+              <w:top w:w="100" w:type="dxa"/>
+              <w:bottom w:w="100" w:type="dxa"/>
+              <w:left w:w="100" w:type="dxa"/>
+              <w:right w:w="100" w:type="dxa"/>
+            </w:tcMar>
+            <w:shd w:fill="F2F6FA"/>
+          </w:tcPr>
+          <w:p>
+            <w:pPr>
+              <w:spacing w:after="0" w:line="245" w:lineRule="auto"/>
+            </w:pPr>
+            <w:r>
+              <w:rPr>
+                <w:b w:val="0"/>
+                <w:color w:val="000000"/>
+                <w:sz w:val="16"/>
+              </w:rPr>
+              <w:t>Subscription or resource group</w:t>
+            </w:r>
+          </w:p>
+        </w:tc>
+        <w:tc>
+          <w:tcPr>
+            <w:tcW w:type="dxa" w:w="4464"/>
+            <w:vAlign w:val="center"/>
+            <w:tcMar>
+              <w:top w:w="100" w:type="dxa"/>
+              <w:bottom w:w="100" w:type="dxa"/>
+              <w:left w:w="100" w:type="dxa"/>
+              <w:right w:w="100" w:type="dxa"/>
+            </w:tcMar>
+            <w:shd w:fill="F2F6FA"/>
+          </w:tcPr>
+          <w:p>
+            <w:pPr>
+              <w:spacing w:after="0" w:line="245" w:lineRule="auto"/>
+            </w:pPr>
+            <w:r>
+              <w:rPr>
+                <w:b w:val="0"/>
+                <w:color w:val="000000"/>
+                <w:sz w:val="16"/>
+              </w:rPr>
+              <w:t>Approximate. Use subscriptions for strong environment or policy boundaries and resource groups for lifecycle grouping.</w:t>
+            </w:r>
+          </w:p>
+        </w:tc>
+      </w:tr>
+      <w:tr>
+        <w:trPr>
+          <w:cantSplit/>
+        </w:trPr>
+        <w:tc>
+          <w:tcPr>
+            <w:tcW w:type="dxa" w:w="2664"/>
+            <w:vAlign w:val="center"/>
+            <w:tcMar>
+              <w:top w:w="100" w:type="dxa"/>
+              <w:bottom w:w="100" w:type="dxa"/>
+              <w:left w:w="100" w:type="dxa"/>
+              <w:right w:w="100" w:type="dxa"/>
+            </w:tcMar>
+            <w:shd w:fill="FFFFFF"/>
+          </w:tcPr>
+          <w:p>
+            <w:pPr>
+              <w:spacing w:after="0" w:line="245" w:lineRule="auto"/>
+            </w:pPr>
+            <w:r>
+              <w:rPr>
+                <w:b w:val="0"/>
+                <w:color w:val="000000"/>
+                <w:sz w:val="16"/>
+              </w:rPr>
+              <w:t>Virtual Cloud Network (VCN)</w:t>
+            </w:r>
+          </w:p>
+        </w:tc>
+        <w:tc>
+          <w:tcPr>
+            <w:tcW w:type="dxa" w:w="2952"/>
+            <w:vAlign w:val="center"/>
+            <w:tcMar>
+              <w:top w:w="100" w:type="dxa"/>
+              <w:bottom w:w="100" w:type="dxa"/>
+              <w:left w:w="100" w:type="dxa"/>
+              <w:right w:w="100" w:type="dxa"/>
+            </w:tcMar>
+            <w:shd w:fill="FFFFFF"/>
+          </w:tcPr>
+          <w:p>
+            <w:pPr>
+              <w:spacing w:after="0" w:line="245" w:lineRule="auto"/>
+            </w:pPr>
+            <w:r>
+              <w:rPr>
+                <w:b w:val="0"/>
+                <w:color w:val="000000"/>
+                <w:sz w:val="16"/>
+              </w:rPr>
+              <w:t>Virtual Network (VNet)</w:t>
+            </w:r>
+          </w:p>
+        </w:tc>
+        <w:tc>
+          <w:tcPr>
+            <w:tcW w:type="dxa" w:w="4464"/>
+            <w:vAlign w:val="center"/>
+            <w:tcMar>
+              <w:top w:w="100" w:type="dxa"/>
+              <w:bottom w:w="100" w:type="dxa"/>
+              <w:left w:w="100" w:type="dxa"/>
+              <w:right w:w="100" w:type="dxa"/>
+            </w:tcMar>
+            <w:shd w:fill="FFFFFF"/>
+          </w:tcPr>
+          <w:p>
+            <w:pPr>
+              <w:spacing w:after="0" w:line="245" w:lineRule="auto"/>
+            </w:pPr>
+            <w:r>
+              <w:rPr>
+                <w:b w:val="0"/>
+                <w:color w:val="000000"/>
+                <w:sz w:val="16"/>
+              </w:rPr>
+              <w:t>Private network boundary for application subnets.</w:t>
+            </w:r>
+          </w:p>
+        </w:tc>
+      </w:tr>
+      <w:tr>
+        <w:trPr>
+          <w:cantSplit/>
+        </w:trPr>
+        <w:tc>
+          <w:tcPr>
+            <w:tcW w:type="dxa" w:w="2664"/>
+            <w:vAlign w:val="center"/>
+            <w:tcMar>
+              <w:top w:w="100" w:type="dxa"/>
+              <w:bottom w:w="100" w:type="dxa"/>
+              <w:left w:w="100" w:type="dxa"/>
+              <w:right w:w="100" w:type="dxa"/>
+            </w:tcMar>
+            <w:shd w:fill="F2F6FA"/>
+          </w:tcPr>
+          <w:p>
+            <w:pPr>
+              <w:spacing w:after="0" w:line="245" w:lineRule="auto"/>
+            </w:pPr>
+            <w:r>
+              <w:rPr>
+                <w:b w:val="0"/>
+                <w:color w:val="000000"/>
+                <w:sz w:val="16"/>
+              </w:rPr>
+              <w:t>Dynamic Routing Gateway (DRG)</w:t>
+            </w:r>
+          </w:p>
+        </w:tc>
+        <w:tc>
+          <w:tcPr>
+            <w:tcW w:type="dxa" w:w="2952"/>
+            <w:vAlign w:val="center"/>
+            <w:tcMar>
+              <w:top w:w="100" w:type="dxa"/>
+              <w:bottom w:w="100" w:type="dxa"/>
+              <w:left w:w="100" w:type="dxa"/>
+              <w:right w:w="100" w:type="dxa"/>
+            </w:tcMar>
+            <w:shd w:fill="F2F6FA"/>
+          </w:tcPr>
+          <w:p>
+            <w:pPr>
+              <w:spacing w:after="0" w:line="245" w:lineRule="auto"/>
+            </w:pPr>
+            <w:r>
+              <w:rPr>
+                <w:b w:val="0"/>
+                <w:color w:val="000000"/>
+                <w:sz w:val="16"/>
+              </w:rPr>
+              <w:t>ExpressRoute virtual network gateway or Virtual WAN hub</w:t>
+            </w:r>
+          </w:p>
+        </w:tc>
+        <w:tc>
+          <w:tcPr>
+            <w:tcW w:type="dxa" w:w="4464"/>
+            <w:vAlign w:val="center"/>
+            <w:tcMar>
+              <w:top w:w="100" w:type="dxa"/>
+              <w:bottom w:w="100" w:type="dxa"/>
+              <w:left w:w="100" w:type="dxa"/>
+              <w:right w:w="100" w:type="dxa"/>
+            </w:tcMar>
+            <w:shd w:fill="F2F6FA"/>
+          </w:tcPr>
+          <w:p>
+            <w:pPr>
+              <w:spacing w:after="0" w:line="245" w:lineRule="auto"/>
+            </w:pPr>
+            <w:r>
+              <w:rPr>
+                <w:b w:val="0"/>
+                <w:color w:val="000000"/>
+                <w:sz w:val="16"/>
+              </w:rPr>
+              <w:t>Approximate. Select the Azure routing construct that connects the hub, spokes and enterprise network.</w:t>
+            </w:r>
+          </w:p>
+        </w:tc>
+      </w:tr>
+      <w:tr>
+        <w:trPr>
+          <w:cantSplit/>
+        </w:trPr>
+        <w:tc>
+          <w:tcPr>
+            <w:tcW w:type="dxa" w:w="2664"/>
+            <w:vAlign w:val="center"/>
+            <w:tcMar>
+              <w:top w:w="100" w:type="dxa"/>
+              <w:bottom w:w="100" w:type="dxa"/>
+              <w:left w:w="100" w:type="dxa"/>
+              <w:right w:w="100" w:type="dxa"/>
+            </w:tcMar>
+            <w:shd w:fill="FFFFFF"/>
+          </w:tcPr>
+          <w:p>
+            <w:pPr>
+              <w:spacing w:after="0" w:line="245" w:lineRule="auto"/>
+            </w:pPr>
+            <w:r>
+              <w:rPr>
+                <w:b w:val="0"/>
+                <w:color w:val="000000"/>
+                <w:sz w:val="16"/>
+              </w:rPr>
+              <w:t>FastConnect</w:t>
+            </w:r>
+          </w:p>
+        </w:tc>
+        <w:tc>
+          <w:tcPr>
+            <w:tcW w:type="dxa" w:w="2952"/>
+            <w:vAlign w:val="center"/>
+            <w:tcMar>
+              <w:top w:w="100" w:type="dxa"/>
+              <w:bottom w:w="100" w:type="dxa"/>
+              <w:left w:w="100" w:type="dxa"/>
+              <w:right w:w="100" w:type="dxa"/>
+            </w:tcMar>
+            <w:shd w:fill="FFFFFF"/>
+          </w:tcPr>
+          <w:p>
+            <w:pPr>
+              <w:spacing w:after="0" w:line="245" w:lineRule="auto"/>
+            </w:pPr>
+            <w:r>
+              <w:rPr>
+                <w:b w:val="0"/>
+                <w:color w:val="000000"/>
+                <w:sz w:val="16"/>
+              </w:rPr>
+              <w:t>ExpressRoute</w:t>
+            </w:r>
+          </w:p>
+        </w:tc>
+        <w:tc>
+          <w:tcPr>
+            <w:tcW w:type="dxa" w:w="4464"/>
+            <w:vAlign w:val="center"/>
+            <w:tcMar>
+              <w:top w:w="100" w:type="dxa"/>
+              <w:bottom w:w="100" w:type="dxa"/>
+              <w:left w:w="100" w:type="dxa"/>
+              <w:right w:w="100" w:type="dxa"/>
+            </w:tcMar>
+            <w:shd w:fill="FFFFFF"/>
+          </w:tcPr>
+          <w:p>
+            <w:pPr>
+              <w:spacing w:after="0" w:line="245" w:lineRule="auto"/>
+            </w:pPr>
+            <w:r>
+              <w:rPr>
+                <w:b w:val="0"/>
+                <w:color w:val="000000"/>
+                <w:sz w:val="16"/>
+              </w:rPr>
+              <w:t>Private provider-based connection between the enterprise network and the cloud.</w:t>
+            </w:r>
+          </w:p>
+        </w:tc>
+      </w:tr>
+      <w:tr>
+        <w:trPr>
+          <w:cantSplit/>
+        </w:trPr>
+        <w:tc>
+          <w:tcPr>
+            <w:tcW w:type="dxa" w:w="2664"/>
+            <w:vAlign w:val="center"/>
+            <w:tcMar>
+              <w:top w:w="100" w:type="dxa"/>
+              <w:bottom w:w="100" w:type="dxa"/>
+              <w:left w:w="100" w:type="dxa"/>
+              <w:right w:w="100" w:type="dxa"/>
+            </w:tcMar>
+            <w:shd w:fill="F2F6FA"/>
+          </w:tcPr>
+          <w:p>
+            <w:pPr>
+              <w:spacing w:after="0" w:line="245" w:lineRule="auto"/>
+            </w:pPr>
+            <w:r>
+              <w:rPr>
+                <w:b w:val="0"/>
+                <w:color w:val="000000"/>
+                <w:sz w:val="16"/>
+              </w:rPr>
+              <w:t>Local or remote VCN peering</w:t>
+            </w:r>
+          </w:p>
+        </w:tc>
+        <w:tc>
+          <w:tcPr>
+            <w:tcW w:type="dxa" w:w="2952"/>
+            <w:vAlign w:val="center"/>
+            <w:tcMar>
+              <w:top w:w="100" w:type="dxa"/>
+              <w:bottom w:w="100" w:type="dxa"/>
+              <w:left w:w="100" w:type="dxa"/>
+              <w:right w:w="100" w:type="dxa"/>
+            </w:tcMar>
+            <w:shd w:fill="F2F6FA"/>
+          </w:tcPr>
+          <w:p>
+            <w:pPr>
+              <w:spacing w:after="0" w:line="245" w:lineRule="auto"/>
+            </w:pPr>
+            <w:r>
+              <w:rPr>
+                <w:b w:val="0"/>
+                <w:color w:val="000000"/>
+                <w:sz w:val="16"/>
+              </w:rPr>
+              <w:t>VNet peering or global VNet peering</w:t>
+            </w:r>
+          </w:p>
+        </w:tc>
+        <w:tc>
+          <w:tcPr>
+            <w:tcW w:type="dxa" w:w="4464"/>
+            <w:vAlign w:val="center"/>
+            <w:tcMar>
+              <w:top w:w="100" w:type="dxa"/>
+              <w:bottom w:w="100" w:type="dxa"/>
+              <w:left w:w="100" w:type="dxa"/>
+              <w:right w:w="100" w:type="dxa"/>
+            </w:tcMar>
+            <w:shd w:fill="F2F6FA"/>
+          </w:tcPr>
+          <w:p>
+            <w:pPr>
+              <w:spacing w:after="0" w:line="245" w:lineRule="auto"/>
+            </w:pPr>
+            <w:r>
+              <w:rPr>
+                <w:b w:val="0"/>
+                <w:color w:val="000000"/>
+                <w:sz w:val="16"/>
+              </w:rPr>
+              <w:t>Private routing between Azure virtual networks.</w:t>
+            </w:r>
+          </w:p>
+        </w:tc>
+      </w:tr>
+      <w:tr>
+        <w:trPr>
+          <w:cantSplit/>
+        </w:trPr>
+        <w:tc>
+          <w:tcPr>
+            <w:tcW w:type="dxa" w:w="2664"/>
+            <w:vAlign w:val="center"/>
+            <w:tcMar>
+              <w:top w:w="100" w:type="dxa"/>
+              <w:bottom w:w="100" w:type="dxa"/>
+              <w:left w:w="100" w:type="dxa"/>
+              <w:right w:w="100" w:type="dxa"/>
+            </w:tcMar>
+            <w:shd w:fill="FFFFFF"/>
+          </w:tcPr>
+          <w:p>
+            <w:pPr>
+              <w:spacing w:after="0" w:line="245" w:lineRule="auto"/>
+            </w:pPr>
+            <w:r>
+              <w:rPr>
+                <w:b w:val="0"/>
+                <w:color w:val="000000"/>
+                <w:sz w:val="16"/>
+              </w:rPr>
+              <w:t>Service Gateway</w:t>
+            </w:r>
+          </w:p>
+        </w:tc>
+        <w:tc>
+          <w:tcPr>
+            <w:tcW w:type="dxa" w:w="2952"/>
+            <w:vAlign w:val="center"/>
+            <w:tcMar>
+              <w:top w:w="100" w:type="dxa"/>
+              <w:bottom w:w="100" w:type="dxa"/>
+              <w:left w:w="100" w:type="dxa"/>
+              <w:right w:w="100" w:type="dxa"/>
+            </w:tcMar>
+            <w:shd w:fill="FFFFFF"/>
+          </w:tcPr>
+          <w:p>
+            <w:pPr>
+              <w:spacing w:after="0" w:line="245" w:lineRule="auto"/>
+            </w:pPr>
+            <w:r>
+              <w:rPr>
+                <w:b w:val="0"/>
+                <w:color w:val="000000"/>
+                <w:sz w:val="16"/>
+              </w:rPr>
+              <w:t>Private Link/private endpoint or service endpoint</w:t>
+            </w:r>
+          </w:p>
+        </w:tc>
+        <w:tc>
+          <w:tcPr>
+            <w:tcW w:type="dxa" w:w="4464"/>
+            <w:vAlign w:val="center"/>
+            <w:tcMar>
+              <w:top w:w="100" w:type="dxa"/>
+              <w:bottom w:w="100" w:type="dxa"/>
+              <w:left w:w="100" w:type="dxa"/>
+              <w:right w:w="100" w:type="dxa"/>
+            </w:tcMar>
+            <w:shd w:fill="FFFFFF"/>
+          </w:tcPr>
+          <w:p>
+            <w:pPr>
+              <w:spacing w:after="0" w:line="245" w:lineRule="auto"/>
+            </w:pPr>
+            <w:r>
+              <w:rPr>
+                <w:b w:val="0"/>
+                <w:color w:val="000000"/>
+                <w:sz w:val="16"/>
+              </w:rPr>
+              <w:t>Approximate. Prefer private endpoints when the Azure service supports them.</w:t>
+            </w:r>
+          </w:p>
+        </w:tc>
+      </w:tr>
+      <w:tr>
+        <w:trPr>
+          <w:cantSplit/>
+        </w:trPr>
+        <w:tc>
+          <w:tcPr>
+            <w:tcW w:type="dxa" w:w="2664"/>
+            <w:vAlign w:val="center"/>
+            <w:tcMar>
+              <w:top w:w="100" w:type="dxa"/>
+              <w:bottom w:w="100" w:type="dxa"/>
+              <w:left w:w="100" w:type="dxa"/>
+              <w:right w:w="100" w:type="dxa"/>
+            </w:tcMar>
+            <w:shd w:fill="F2F6FA"/>
+          </w:tcPr>
+          <w:p>
+            <w:pPr>
+              <w:spacing w:after="0" w:line="245" w:lineRule="auto"/>
+            </w:pPr>
+            <w:r>
+              <w:rPr>
+                <w:b w:val="0"/>
+                <w:color w:val="000000"/>
+                <w:sz w:val="16"/>
+              </w:rPr>
+              <w:t>NAT Gateway</w:t>
+            </w:r>
+          </w:p>
+        </w:tc>
+        <w:tc>
+          <w:tcPr>
+            <w:tcW w:type="dxa" w:w="2952"/>
+            <w:vAlign w:val="center"/>
+            <w:tcMar>
+              <w:top w:w="100" w:type="dxa"/>
+              <w:bottom w:w="100" w:type="dxa"/>
+              <w:left w:w="100" w:type="dxa"/>
+              <w:right w:w="100" w:type="dxa"/>
+            </w:tcMar>
+            <w:shd w:fill="F2F6FA"/>
+          </w:tcPr>
+          <w:p>
+            <w:pPr>
+              <w:spacing w:after="0" w:line="245" w:lineRule="auto"/>
+            </w:pPr>
+            <w:r>
+              <w:rPr>
+                <w:b w:val="0"/>
+                <w:color w:val="000000"/>
+                <w:sz w:val="16"/>
+              </w:rPr>
+              <w:t>Azure NAT Gateway</w:t>
+            </w:r>
+          </w:p>
+        </w:tc>
+        <w:tc>
+          <w:tcPr>
+            <w:tcW w:type="dxa" w:w="4464"/>
+            <w:vAlign w:val="center"/>
+            <w:tcMar>
+              <w:top w:w="100" w:type="dxa"/>
+              <w:bottom w:w="100" w:type="dxa"/>
+              <w:left w:w="100" w:type="dxa"/>
+              <w:right w:w="100" w:type="dxa"/>
+            </w:tcMar>
+            <w:shd w:fill="F2F6FA"/>
+          </w:tcPr>
+          <w:p>
+            <w:pPr>
+              <w:spacing w:after="0" w:line="245" w:lineRule="auto"/>
+            </w:pPr>
+            <w:r>
+              <w:rPr>
+                <w:b w:val="0"/>
+                <w:color w:val="000000"/>
+                <w:sz w:val="16"/>
+              </w:rPr>
+              <w:t>Controlled outbound internet connectivity for private subnets; it does not provide inbound access.</w:t>
+            </w:r>
+          </w:p>
+        </w:tc>
+      </w:tr>
+      <w:tr>
+        <w:trPr>
+          <w:cantSplit/>
+        </w:trPr>
+        <w:tc>
+          <w:tcPr>
+            <w:tcW w:type="dxa" w:w="2664"/>
+            <w:vAlign w:val="center"/>
+            <w:tcMar>
+              <w:top w:w="100" w:type="dxa"/>
+              <w:bottom w:w="100" w:type="dxa"/>
+              <w:left w:w="100" w:type="dxa"/>
+              <w:right w:w="100" w:type="dxa"/>
+            </w:tcMar>
+            <w:shd w:fill="FFFFFF"/>
+          </w:tcPr>
+          <w:p>
+            <w:pPr>
+              <w:spacing w:after="0" w:line="245" w:lineRule="auto"/>
+            </w:pPr>
+            <w:r>
+              <w:rPr>
+                <w:b w:val="0"/>
+                <w:color w:val="000000"/>
+                <w:sz w:val="16"/>
+              </w:rPr>
+              <w:t>Security List / Network Security Group</w:t>
+            </w:r>
+          </w:p>
+        </w:tc>
+        <w:tc>
+          <w:tcPr>
+            <w:tcW w:type="dxa" w:w="2952"/>
+            <w:vAlign w:val="center"/>
+            <w:tcMar>
+              <w:top w:w="100" w:type="dxa"/>
+              <w:bottom w:w="100" w:type="dxa"/>
+              <w:left w:w="100" w:type="dxa"/>
+              <w:right w:w="100" w:type="dxa"/>
+            </w:tcMar>
+            <w:shd w:fill="FFFFFF"/>
+          </w:tcPr>
+          <w:p>
+            <w:pPr>
+              <w:spacing w:after="0" w:line="245" w:lineRule="auto"/>
+            </w:pPr>
+            <w:r>
+              <w:rPr>
+                <w:b w:val="0"/>
+                <w:color w:val="000000"/>
+                <w:sz w:val="16"/>
+              </w:rPr>
+              <w:t>Network Security Group (NSG)</w:t>
+            </w:r>
+          </w:p>
+        </w:tc>
+        <w:tc>
+          <w:tcPr>
+            <w:tcW w:type="dxa" w:w="4464"/>
+            <w:vAlign w:val="center"/>
+            <w:tcMar>
+              <w:top w:w="100" w:type="dxa"/>
+              <w:bottom w:w="100" w:type="dxa"/>
+              <w:left w:w="100" w:type="dxa"/>
+              <w:right w:w="100" w:type="dxa"/>
+            </w:tcMar>
+            <w:shd w:fill="FFFFFF"/>
+          </w:tcPr>
+          <w:p>
+            <w:pPr>
+              <w:spacing w:after="0" w:line="245" w:lineRule="auto"/>
+            </w:pPr>
+            <w:r>
+              <w:rPr>
+                <w:b w:val="0"/>
+                <w:color w:val="000000"/>
+                <w:sz w:val="16"/>
+              </w:rPr>
+              <w:t>Filter traffic at Azure subnet or network-interface scope.</w:t>
+            </w:r>
+          </w:p>
+        </w:tc>
+      </w:tr>
+      <w:tr>
+        <w:trPr>
+          <w:cantSplit/>
+        </w:trPr>
+        <w:tc>
+          <w:tcPr>
+            <w:tcW w:type="dxa" w:w="2664"/>
+            <w:vAlign w:val="center"/>
+            <w:tcMar>
+              <w:top w:w="100" w:type="dxa"/>
+              <w:bottom w:w="100" w:type="dxa"/>
+              <w:left w:w="100" w:type="dxa"/>
+              <w:right w:w="100" w:type="dxa"/>
+            </w:tcMar>
+            <w:shd w:fill="F2F6FA"/>
+          </w:tcPr>
+          <w:p>
+            <w:pPr>
+              <w:spacing w:after="0" w:line="245" w:lineRule="auto"/>
+            </w:pPr>
+            <w:r>
+              <w:rPr>
+                <w:b w:val="0"/>
+                <w:color w:val="000000"/>
+                <w:sz w:val="16"/>
+              </w:rPr>
+              <w:t>Route table / route rule</w:t>
+            </w:r>
+          </w:p>
+        </w:tc>
+        <w:tc>
+          <w:tcPr>
+            <w:tcW w:type="dxa" w:w="2952"/>
+            <w:vAlign w:val="center"/>
+            <w:tcMar>
+              <w:top w:w="100" w:type="dxa"/>
+              <w:bottom w:w="100" w:type="dxa"/>
+              <w:left w:w="100" w:type="dxa"/>
+              <w:right w:w="100" w:type="dxa"/>
+            </w:tcMar>
+            <w:shd w:fill="F2F6FA"/>
+          </w:tcPr>
+          <w:p>
+            <w:pPr>
+              <w:spacing w:after="0" w:line="245" w:lineRule="auto"/>
+            </w:pPr>
+            <w:r>
+              <w:rPr>
+                <w:b w:val="0"/>
+                <w:color w:val="000000"/>
+                <w:sz w:val="16"/>
+              </w:rPr>
+              <w:t>Route table / user-defined route (UDR)</w:t>
+            </w:r>
+          </w:p>
+        </w:tc>
+        <w:tc>
+          <w:tcPr>
+            <w:tcW w:type="dxa" w:w="4464"/>
+            <w:vAlign w:val="center"/>
+            <w:tcMar>
+              <w:top w:w="100" w:type="dxa"/>
+              <w:bottom w:w="100" w:type="dxa"/>
+              <w:left w:w="100" w:type="dxa"/>
+              <w:right w:w="100" w:type="dxa"/>
+            </w:tcMar>
+            <w:shd w:fill="F2F6FA"/>
+          </w:tcPr>
+          <w:p>
+            <w:pPr>
+              <w:spacing w:after="0" w:line="245" w:lineRule="auto"/>
+            </w:pPr>
+            <w:r>
+              <w:rPr>
+                <w:b w:val="0"/>
+                <w:color w:val="000000"/>
+                <w:sz w:val="16"/>
+              </w:rPr>
+              <w:t>Direct spoke traffic through the enterprise firewall, gateway or approved next hop.</w:t>
+            </w:r>
+          </w:p>
+        </w:tc>
+      </w:tr>
+      <w:tr>
+        <w:trPr>
+          <w:cantSplit/>
+        </w:trPr>
+        <w:tc>
+          <w:tcPr>
+            <w:tcW w:type="dxa" w:w="2664"/>
+            <w:vAlign w:val="center"/>
+            <w:tcMar>
+              <w:top w:w="100" w:type="dxa"/>
+              <w:bottom w:w="100" w:type="dxa"/>
+              <w:left w:w="100" w:type="dxa"/>
+              <w:right w:w="100" w:type="dxa"/>
+            </w:tcMar>
+            <w:shd w:fill="FFFFFF"/>
+          </w:tcPr>
+          <w:p>
+            <w:pPr>
+              <w:spacing w:after="0" w:line="245" w:lineRule="auto"/>
+            </w:pPr>
+            <w:r>
+              <w:rPr>
+                <w:b w:val="0"/>
+                <w:color w:val="000000"/>
+                <w:sz w:val="16"/>
+              </w:rPr>
+              <w:t>OCI Bastion</w:t>
+            </w:r>
+          </w:p>
+        </w:tc>
+        <w:tc>
+          <w:tcPr>
+            <w:tcW w:type="dxa" w:w="2952"/>
+            <w:vAlign w:val="center"/>
+            <w:tcMar>
+              <w:top w:w="100" w:type="dxa"/>
+              <w:bottom w:w="100" w:type="dxa"/>
+              <w:left w:w="100" w:type="dxa"/>
+              <w:right w:w="100" w:type="dxa"/>
+            </w:tcMar>
+            <w:shd w:fill="FFFFFF"/>
+          </w:tcPr>
+          <w:p>
+            <w:pPr>
+              <w:spacing w:after="0" w:line="245" w:lineRule="auto"/>
+            </w:pPr>
+            <w:r>
+              <w:rPr>
+                <w:b w:val="0"/>
+                <w:color w:val="000000"/>
+                <w:sz w:val="16"/>
+              </w:rPr>
+              <w:t>Azure Bastion</w:t>
+            </w:r>
+          </w:p>
+        </w:tc>
+        <w:tc>
+          <w:tcPr>
+            <w:tcW w:type="dxa" w:w="4464"/>
+            <w:vAlign w:val="center"/>
+            <w:tcMar>
+              <w:top w:w="100" w:type="dxa"/>
+              <w:bottom w:w="100" w:type="dxa"/>
+              <w:left w:w="100" w:type="dxa"/>
+              <w:right w:w="100" w:type="dxa"/>
+            </w:tcMar>
+            <w:shd w:fill="FFFFFF"/>
+          </w:tcPr>
+          <w:p>
+            <w:pPr>
+              <w:spacing w:after="0" w:line="245" w:lineRule="auto"/>
+            </w:pPr>
+            <w:r>
+              <w:rPr>
+                <w:b w:val="0"/>
+                <w:color w:val="000000"/>
+                <w:sz w:val="16"/>
+              </w:rPr>
+              <w:t>Optional interactive administration service; routine POC access remains through the approved enterprise jump host.</w:t>
+            </w:r>
+          </w:p>
+        </w:tc>
+      </w:tr>
+      <w:tr>
+        <w:trPr>
+          <w:cantSplit/>
+        </w:trPr>
+        <w:tc>
+          <w:tcPr>
+            <w:tcW w:type="dxa" w:w="2664"/>
+            <w:vAlign w:val="center"/>
+            <w:tcMar>
+              <w:top w:w="100" w:type="dxa"/>
+              <w:bottom w:w="100" w:type="dxa"/>
+              <w:left w:w="100" w:type="dxa"/>
+              <w:right w:w="100" w:type="dxa"/>
+            </w:tcMar>
+            <w:shd w:fill="F2F6FA"/>
+          </w:tcPr>
+          <w:p>
+            <w:pPr>
+              <w:spacing w:after="0" w:line="245" w:lineRule="auto"/>
+            </w:pPr>
+            <w:r>
+              <w:rPr>
+                <w:b w:val="0"/>
+                <w:color w:val="000000"/>
+                <w:sz w:val="16"/>
+              </w:rPr>
+              <w:t>OCI Load Balancer</w:t>
+            </w:r>
+          </w:p>
+        </w:tc>
+        <w:tc>
+          <w:tcPr>
+            <w:tcW w:type="dxa" w:w="2952"/>
+            <w:vAlign w:val="center"/>
+            <w:tcMar>
+              <w:top w:w="100" w:type="dxa"/>
+              <w:bottom w:w="100" w:type="dxa"/>
+              <w:left w:w="100" w:type="dxa"/>
+              <w:right w:w="100" w:type="dxa"/>
+            </w:tcMar>
+            <w:shd w:fill="F2F6FA"/>
+          </w:tcPr>
+          <w:p>
+            <w:pPr>
+              <w:spacing w:after="0" w:line="245" w:lineRule="auto"/>
+            </w:pPr>
+            <w:r>
+              <w:rPr>
+                <w:b w:val="0"/>
+                <w:color w:val="000000"/>
+                <w:sz w:val="16"/>
+              </w:rPr>
+              <w:t>Azure Load Balancer or Application Gateway</w:t>
+            </w:r>
+          </w:p>
+        </w:tc>
+        <w:tc>
+          <w:tcPr>
+            <w:tcW w:type="dxa" w:w="4464"/>
+            <w:vAlign w:val="center"/>
+            <w:tcMar>
+              <w:top w:w="100" w:type="dxa"/>
+              <w:bottom w:w="100" w:type="dxa"/>
+              <w:left w:w="100" w:type="dxa"/>
+              <w:right w:w="100" w:type="dxa"/>
+            </w:tcMar>
+            <w:shd w:fill="F2F6FA"/>
+          </w:tcPr>
+          <w:p>
+            <w:pPr>
+              <w:spacing w:after="0" w:line="245" w:lineRule="auto"/>
+            </w:pPr>
+            <w:r>
+              <w:rPr>
+                <w:b w:val="0"/>
+                <w:color w:val="000000"/>
+                <w:sz w:val="16"/>
+              </w:rPr>
+              <w:t>Use Load Balancer for Layer 4 traffic and Application Gateway for Layer 7 HTTPS and WAF features.</w:t>
+            </w:r>
+          </w:p>
+        </w:tc>
+      </w:tr>
+    </w:tbl>
+    <w:p>
+      <w:pPr>
+        <w:pStyle w:val="Heading2"/>
+      </w:pPr>
+      <w:r>
+        <w:t>Compute, Kubernetes and Data</w:t>
+      </w:r>
+    </w:p>
+    <w:tbl>
+      <w:tblPr>
+        <w:tblW w:type="auto" w:w="0"/>
+        <w:jc w:val="center"/>
+        <w:tblLayout w:type="fixed"/>
+        <w:tblLook w:firstColumn="1" w:firstRow="1" w:lastColumn="0" w:lastRow="0" w:noHBand="0" w:noVBand="1" w:val="04A0"/>
+        <w:tblBorders>
+          <w:top w:val="single" w:sz="4" w:color="D9D9D9"/>
+          <w:left w:val="single" w:sz="4" w:color="D9D9D9"/>
+          <w:bottom w:val="single" w:sz="4" w:color="D9D9D9"/>
+          <w:right w:val="single" w:sz="4" w:color="D9D9D9"/>
+          <w:insideH w:val="single" w:sz="4" w:color="D9D9D9"/>
+          <w:insideV w:val="single" w:sz="4" w:color="D9D9D9"/>
+        </w:tblBorders>
+      </w:tblPr>
+      <w:tblGrid>
+        <w:gridCol w:w="2664"/>
+        <w:gridCol w:w="2952"/>
+        <w:gridCol w:w="4464"/>
+      </w:tblGrid>
+      <w:tr>
+        <w:trPr>
+          <w:cantSplit/>
+          <w:tblHeader/>
+        </w:trPr>
+        <w:tc>
+          <w:tcPr>
+            <w:tcW w:type="dxa" w:w="2664"/>
+            <w:vAlign w:val="center"/>
+            <w:tcMar>
+              <w:top w:w="100" w:type="dxa"/>
+              <w:bottom w:w="100" w:type="dxa"/>
+              <w:left w:w="100" w:type="dxa"/>
+              <w:right w:w="100" w:type="dxa"/>
+            </w:tcMar>
+            <w:shd w:fill="203864"/>
+          </w:tcPr>
+          <w:p>
+            <w:pPr>
+              <w:spacing w:after="0" w:line="245" w:lineRule="auto"/>
+            </w:pPr>
+            <w:r>
+              <w:rPr>
+                <w:b/>
+                <w:color w:val="FFFFFF"/>
+                <w:sz w:val="16"/>
+              </w:rPr>
+              <w:t>OCI term</w:t>
+            </w:r>
+          </w:p>
+        </w:tc>
+        <w:tc>
+          <w:tcPr>
+            <w:tcW w:type="dxa" w:w="2952"/>
+            <w:vAlign w:val="center"/>
+            <w:tcMar>
+              <w:top w:w="100" w:type="dxa"/>
+              <w:bottom w:w="100" w:type="dxa"/>
+              <w:left w:w="100" w:type="dxa"/>
+              <w:right w:w="100" w:type="dxa"/>
+            </w:tcMar>
+            <w:shd w:fill="203864"/>
+          </w:tcPr>
+          <w:p>
+            <w:pPr>
+              <w:spacing w:after="0" w:line="245" w:lineRule="auto"/>
+            </w:pPr>
+            <w:r>
+              <w:rPr>
+                <w:b/>
+                <w:color w:val="FFFFFF"/>
+                <w:sz w:val="16"/>
+              </w:rPr>
+              <w:t>Azure term</w:t>
+            </w:r>
+          </w:p>
+        </w:tc>
+        <w:tc>
+          <w:tcPr>
+            <w:tcW w:type="dxa" w:w="4464"/>
+            <w:vAlign w:val="center"/>
+            <w:tcMar>
+              <w:top w:w="100" w:type="dxa"/>
+              <w:bottom w:w="100" w:type="dxa"/>
+              <w:left w:w="100" w:type="dxa"/>
+              <w:right w:w="100" w:type="dxa"/>
+            </w:tcMar>
+            <w:shd w:fill="203864"/>
+          </w:tcPr>
+          <w:p>
+            <w:pPr>
+              <w:spacing w:after="0" w:line="245" w:lineRule="auto"/>
+            </w:pPr>
+            <w:r>
+              <w:rPr>
+                <w:b/>
+                <w:color w:val="FFFFFF"/>
+                <w:sz w:val="16"/>
+              </w:rPr>
+              <w:t>POC interpretation</w:t>
+            </w:r>
+          </w:p>
+        </w:tc>
+      </w:tr>
+      <w:tr>
+        <w:trPr>
+          <w:cantSplit/>
+        </w:trPr>
+        <w:tc>
+          <w:tcPr>
+            <w:tcW w:type="dxa" w:w="2664"/>
+            <w:vAlign w:val="center"/>
+            <w:tcMar>
+              <w:top w:w="100" w:type="dxa"/>
+              <w:bottom w:w="100" w:type="dxa"/>
+              <w:left w:w="100" w:type="dxa"/>
+              <w:right w:w="100" w:type="dxa"/>
+            </w:tcMar>
+            <w:shd w:fill="FFFFFF"/>
+          </w:tcPr>
+          <w:p>
+            <w:pPr>
+              <w:spacing w:after="0" w:line="245" w:lineRule="auto"/>
+            </w:pPr>
+            <w:r>
+              <w:rPr>
+                <w:b w:val="0"/>
+                <w:color w:val="000000"/>
+                <w:sz w:val="16"/>
+              </w:rPr>
+              <w:t>Oracle Kubernetes Engine (OKE)</w:t>
+            </w:r>
+          </w:p>
+        </w:tc>
+        <w:tc>
+          <w:tcPr>
+            <w:tcW w:type="dxa" w:w="2952"/>
+            <w:vAlign w:val="center"/>
+            <w:tcMar>
+              <w:top w:w="100" w:type="dxa"/>
+              <w:bottom w:w="100" w:type="dxa"/>
+              <w:left w:w="100" w:type="dxa"/>
+              <w:right w:w="100" w:type="dxa"/>
+            </w:tcMar>
+            <w:shd w:fill="FFFFFF"/>
+          </w:tcPr>
+          <w:p>
+            <w:pPr>
+              <w:spacing w:after="0" w:line="245" w:lineRule="auto"/>
+            </w:pPr>
+            <w:r>
+              <w:rPr>
+                <w:b w:val="0"/>
+                <w:color w:val="000000"/>
+                <w:sz w:val="16"/>
+              </w:rPr>
+              <w:t>Azure Kubernetes Service (AKS)</w:t>
+            </w:r>
+          </w:p>
+        </w:tc>
+        <w:tc>
+          <w:tcPr>
+            <w:tcW w:type="dxa" w:w="4464"/>
+            <w:vAlign w:val="center"/>
+            <w:tcMar>
+              <w:top w:w="100" w:type="dxa"/>
+              <w:bottom w:w="100" w:type="dxa"/>
+              <w:left w:w="100" w:type="dxa"/>
+              <w:right w:w="100" w:type="dxa"/>
+            </w:tcMar>
+            <w:shd w:fill="FFFFFF"/>
+          </w:tcPr>
+          <w:p>
+            <w:pPr>
+              <w:spacing w:after="0" w:line="245" w:lineRule="auto"/>
+            </w:pPr>
+            <w:r>
+              <w:rPr>
+                <w:b w:val="0"/>
+                <w:color w:val="000000"/>
+                <w:sz w:val="16"/>
+              </w:rPr>
+              <w:t>Managed Kubernetes equivalent. The current POC may use self-managed Kubernetes when vendor OS requirements prevent AKS.</w:t>
+            </w:r>
+          </w:p>
+        </w:tc>
+      </w:tr>
+      <w:tr>
+        <w:trPr>
+          <w:cantSplit/>
+        </w:trPr>
+        <w:tc>
+          <w:tcPr>
+            <w:tcW w:type="dxa" w:w="2664"/>
+            <w:vAlign w:val="center"/>
+            <w:tcMar>
+              <w:top w:w="100" w:type="dxa"/>
+              <w:bottom w:w="100" w:type="dxa"/>
+              <w:left w:w="100" w:type="dxa"/>
+              <w:right w:w="100" w:type="dxa"/>
+            </w:tcMar>
+            <w:shd w:fill="F2F6FA"/>
+          </w:tcPr>
+          <w:p>
+            <w:pPr>
+              <w:spacing w:after="0" w:line="245" w:lineRule="auto"/>
+            </w:pPr>
+            <w:r>
+              <w:rPr>
+                <w:b w:val="0"/>
+                <w:color w:val="000000"/>
+                <w:sz w:val="16"/>
+              </w:rPr>
+              <w:t>Compute instance / shape</w:t>
+            </w:r>
+          </w:p>
+        </w:tc>
+        <w:tc>
+          <w:tcPr>
+            <w:tcW w:type="dxa" w:w="2952"/>
+            <w:vAlign w:val="center"/>
+            <w:tcMar>
+              <w:top w:w="100" w:type="dxa"/>
+              <w:bottom w:w="100" w:type="dxa"/>
+              <w:left w:w="100" w:type="dxa"/>
+              <w:right w:w="100" w:type="dxa"/>
+            </w:tcMar>
+            <w:shd w:fill="F2F6FA"/>
+          </w:tcPr>
+          <w:p>
+            <w:pPr>
+              <w:spacing w:after="0" w:line="245" w:lineRule="auto"/>
+            </w:pPr>
+            <w:r>
+              <w:rPr>
+                <w:b w:val="0"/>
+                <w:color w:val="000000"/>
+                <w:sz w:val="16"/>
+              </w:rPr>
+              <w:t>Virtual machine / VM size</w:t>
+            </w:r>
+          </w:p>
+        </w:tc>
+        <w:tc>
+          <w:tcPr>
+            <w:tcW w:type="dxa" w:w="4464"/>
+            <w:vAlign w:val="center"/>
+            <w:tcMar>
+              <w:top w:w="100" w:type="dxa"/>
+              <w:bottom w:w="100" w:type="dxa"/>
+              <w:left w:w="100" w:type="dxa"/>
+              <w:right w:w="100" w:type="dxa"/>
+            </w:tcMar>
+            <w:shd w:fill="F2F6FA"/>
+          </w:tcPr>
+          <w:p>
+            <w:pPr>
+              <w:spacing w:after="0" w:line="245" w:lineRule="auto"/>
+            </w:pPr>
+            <w:r>
+              <w:rPr>
+                <w:b w:val="0"/>
+                <w:color w:val="000000"/>
+                <w:sz w:val="16"/>
+              </w:rPr>
+              <w:t>Azure sizes are selected by CPU, memory, disk, network and accelerator requirements; shape names do not translate directly.</w:t>
+            </w:r>
+          </w:p>
+        </w:tc>
+      </w:tr>
+      <w:tr>
+        <w:trPr>
+          <w:cantSplit/>
+        </w:trPr>
+        <w:tc>
+          <w:tcPr>
+            <w:tcW w:type="dxa" w:w="2664"/>
+            <w:vAlign w:val="center"/>
+            <w:tcMar>
+              <w:top w:w="100" w:type="dxa"/>
+              <w:bottom w:w="100" w:type="dxa"/>
+              <w:left w:w="100" w:type="dxa"/>
+              <w:right w:w="100" w:type="dxa"/>
+            </w:tcMar>
+            <w:shd w:fill="FFFFFF"/>
+          </w:tcPr>
+          <w:p>
+            <w:pPr>
+              <w:spacing w:after="0" w:line="245" w:lineRule="auto"/>
+            </w:pPr>
+            <w:r>
+              <w:rPr>
+                <w:b w:val="0"/>
+                <w:color w:val="000000"/>
+                <w:sz w:val="16"/>
+              </w:rPr>
+              <w:t>VM.Standard.E6.Flex</w:t>
+            </w:r>
+          </w:p>
+        </w:tc>
+        <w:tc>
+          <w:tcPr>
+            <w:tcW w:type="dxa" w:w="2952"/>
+            <w:vAlign w:val="center"/>
+            <w:tcMar>
+              <w:top w:w="100" w:type="dxa"/>
+              <w:bottom w:w="100" w:type="dxa"/>
+              <w:left w:w="100" w:type="dxa"/>
+              <w:right w:w="100" w:type="dxa"/>
+            </w:tcMar>
+            <w:shd w:fill="FFFFFF"/>
+          </w:tcPr>
+          <w:p>
+            <w:pPr>
+              <w:spacing w:after="0" w:line="245" w:lineRule="auto"/>
+            </w:pPr>
+            <w:r>
+              <w:rPr>
+                <w:b w:val="0"/>
+                <w:color w:val="000000"/>
+                <w:sz w:val="16"/>
+              </w:rPr>
+              <w:t>E-series AMD VM candidate</w:t>
+            </w:r>
+          </w:p>
+        </w:tc>
+        <w:tc>
+          <w:tcPr>
+            <w:tcW w:type="dxa" w:w="4464"/>
+            <w:vAlign w:val="center"/>
+            <w:tcMar>
+              <w:top w:w="100" w:type="dxa"/>
+              <w:bottom w:w="100" w:type="dxa"/>
+              <w:left w:w="100" w:type="dxa"/>
+              <w:right w:w="100" w:type="dxa"/>
+            </w:tcMar>
+            <w:shd w:fill="FFFFFF"/>
+          </w:tcPr>
+          <w:p>
+            <w:pPr>
+              <w:spacing w:after="0" w:line="245" w:lineRule="auto"/>
+            </w:pPr>
+            <w:r>
+              <w:rPr>
+                <w:b w:val="0"/>
+                <w:color w:val="000000"/>
+                <w:sz w:val="16"/>
+              </w:rPr>
+              <w:t>Approximate. Standard_E16as_v5 is the initial DataWalk candidate for 16 vCPUs and 128 GiB memory.</w:t>
+            </w:r>
+          </w:p>
+        </w:tc>
+      </w:tr>
+      <w:tr>
+        <w:trPr>
+          <w:cantSplit/>
+        </w:trPr>
+        <w:tc>
+          <w:tcPr>
+            <w:tcW w:type="dxa" w:w="2664"/>
+            <w:vAlign w:val="center"/>
+            <w:tcMar>
+              <w:top w:w="100" w:type="dxa"/>
+              <w:bottom w:w="100" w:type="dxa"/>
+              <w:left w:w="100" w:type="dxa"/>
+              <w:right w:w="100" w:type="dxa"/>
+            </w:tcMar>
+            <w:shd w:fill="F2F6FA"/>
+          </w:tcPr>
+          <w:p>
+            <w:pPr>
+              <w:spacing w:after="0" w:line="245" w:lineRule="auto"/>
+            </w:pPr>
+            <w:r>
+              <w:rPr>
+                <w:b w:val="0"/>
+                <w:color w:val="000000"/>
+                <w:sz w:val="16"/>
+              </w:rPr>
+              <w:t>VM.GPU.A10.2</w:t>
+            </w:r>
+          </w:p>
+        </w:tc>
+        <w:tc>
+          <w:tcPr>
+            <w:tcW w:type="dxa" w:w="2952"/>
+            <w:vAlign w:val="center"/>
+            <w:tcMar>
+              <w:top w:w="100" w:type="dxa"/>
+              <w:bottom w:w="100" w:type="dxa"/>
+              <w:left w:w="100" w:type="dxa"/>
+              <w:right w:w="100" w:type="dxa"/>
+            </w:tcMar>
+            <w:shd w:fill="F2F6FA"/>
+          </w:tcPr>
+          <w:p>
+            <w:pPr>
+              <w:spacing w:after="0" w:line="245" w:lineRule="auto"/>
+            </w:pPr>
+            <w:r>
+              <w:rPr>
+                <w:b w:val="0"/>
+                <w:color w:val="000000"/>
+                <w:sz w:val="16"/>
+              </w:rPr>
+              <w:t>Standard_NV72ads_A10_v5 candidate</w:t>
+            </w:r>
+          </w:p>
+        </w:tc>
+        <w:tc>
+          <w:tcPr>
+            <w:tcW w:type="dxa" w:w="4464"/>
+            <w:vAlign w:val="center"/>
+            <w:tcMar>
+              <w:top w:w="100" w:type="dxa"/>
+              <w:bottom w:w="100" w:type="dxa"/>
+              <w:left w:w="100" w:type="dxa"/>
+              <w:right w:w="100" w:type="dxa"/>
+            </w:tcMar>
+            <w:shd w:fill="F2F6FA"/>
+          </w:tcPr>
+          <w:p>
+            <w:pPr>
+              <w:spacing w:after="0" w:line="245" w:lineRule="auto"/>
+            </w:pPr>
+            <w:r>
+              <w:rPr>
+                <w:b w:val="0"/>
+                <w:color w:val="000000"/>
+                <w:sz w:val="16"/>
+              </w:rPr>
+              <w:t>Approximate. Both expose two NVIDIA A10 GPUs, but quota, regional availability, drivers and vendor support must be validated.</w:t>
+            </w:r>
+          </w:p>
+        </w:tc>
+      </w:tr>
+      <w:tr>
+        <w:trPr>
+          <w:cantSplit/>
+        </w:trPr>
+        <w:tc>
+          <w:tcPr>
+            <w:tcW w:type="dxa" w:w="2664"/>
+            <w:vAlign w:val="center"/>
+            <w:tcMar>
+              <w:top w:w="100" w:type="dxa"/>
+              <w:bottom w:w="100" w:type="dxa"/>
+              <w:left w:w="100" w:type="dxa"/>
+              <w:right w:w="100" w:type="dxa"/>
+            </w:tcMar>
+            <w:shd w:fill="FFFFFF"/>
+          </w:tcPr>
+          <w:p>
+            <w:pPr>
+              <w:spacing w:after="0" w:line="245" w:lineRule="auto"/>
+            </w:pPr>
+            <w:r>
+              <w:rPr>
+                <w:b w:val="0"/>
+                <w:color w:val="000000"/>
+                <w:sz w:val="16"/>
+              </w:rPr>
+              <w:t>Block Volume</w:t>
+            </w:r>
+          </w:p>
+        </w:tc>
+        <w:tc>
+          <w:tcPr>
+            <w:tcW w:type="dxa" w:w="2952"/>
+            <w:vAlign w:val="center"/>
+            <w:tcMar>
+              <w:top w:w="100" w:type="dxa"/>
+              <w:bottom w:w="100" w:type="dxa"/>
+              <w:left w:w="100" w:type="dxa"/>
+              <w:right w:w="100" w:type="dxa"/>
+            </w:tcMar>
+            <w:shd w:fill="FFFFFF"/>
+          </w:tcPr>
+          <w:p>
+            <w:pPr>
+              <w:spacing w:after="0" w:line="245" w:lineRule="auto"/>
+            </w:pPr>
+            <w:r>
+              <w:rPr>
+                <w:b w:val="0"/>
+                <w:color w:val="000000"/>
+                <w:sz w:val="16"/>
+              </w:rPr>
+              <w:t>Azure Managed Disks</w:t>
+            </w:r>
+          </w:p>
+        </w:tc>
+        <w:tc>
+          <w:tcPr>
+            <w:tcW w:type="dxa" w:w="4464"/>
+            <w:vAlign w:val="center"/>
+            <w:tcMar>
+              <w:top w:w="100" w:type="dxa"/>
+              <w:bottom w:w="100" w:type="dxa"/>
+              <w:left w:w="100" w:type="dxa"/>
+              <w:right w:w="100" w:type="dxa"/>
+            </w:tcMar>
+            <w:shd w:fill="FFFFFF"/>
+          </w:tcPr>
+          <w:p>
+            <w:pPr>
+              <w:spacing w:after="0" w:line="245" w:lineRule="auto"/>
+            </w:pPr>
+            <w:r>
+              <w:rPr>
+                <w:b w:val="0"/>
+                <w:color w:val="000000"/>
+                <w:sz w:val="16"/>
+              </w:rPr>
+              <w:t>Persistent operating-system and application block storage.</w:t>
+            </w:r>
+          </w:p>
+        </w:tc>
+      </w:tr>
+      <w:tr>
+        <w:trPr>
+          <w:cantSplit/>
+        </w:trPr>
+        <w:tc>
+          <w:tcPr>
+            <w:tcW w:type="dxa" w:w="2664"/>
+            <w:vAlign w:val="center"/>
+            <w:tcMar>
+              <w:top w:w="100" w:type="dxa"/>
+              <w:bottom w:w="100" w:type="dxa"/>
+              <w:left w:w="100" w:type="dxa"/>
+              <w:right w:w="100" w:type="dxa"/>
+            </w:tcMar>
+            <w:shd w:fill="F2F6FA"/>
+          </w:tcPr>
+          <w:p>
+            <w:pPr>
+              <w:spacing w:after="0" w:line="245" w:lineRule="auto"/>
+            </w:pPr>
+            <w:r>
+              <w:rPr>
+                <w:b w:val="0"/>
+                <w:color w:val="000000"/>
+                <w:sz w:val="16"/>
+              </w:rPr>
+              <w:t>File Storage</w:t>
+            </w:r>
+          </w:p>
+        </w:tc>
+        <w:tc>
+          <w:tcPr>
+            <w:tcW w:type="dxa" w:w="2952"/>
+            <w:vAlign w:val="center"/>
+            <w:tcMar>
+              <w:top w:w="100" w:type="dxa"/>
+              <w:bottom w:w="100" w:type="dxa"/>
+              <w:left w:w="100" w:type="dxa"/>
+              <w:right w:w="100" w:type="dxa"/>
+            </w:tcMar>
+            <w:shd w:fill="F2F6FA"/>
+          </w:tcPr>
+          <w:p>
+            <w:pPr>
+              <w:spacing w:after="0" w:line="245" w:lineRule="auto"/>
+            </w:pPr>
+            <w:r>
+              <w:rPr>
+                <w:b w:val="0"/>
+                <w:color w:val="000000"/>
+                <w:sz w:val="16"/>
+              </w:rPr>
+              <w:t>Azure Files or Azure NetApp Files</w:t>
+            </w:r>
+          </w:p>
+        </w:tc>
+        <w:tc>
+          <w:tcPr>
+            <w:tcW w:type="dxa" w:w="4464"/>
+            <w:vAlign w:val="center"/>
+            <w:tcMar>
+              <w:top w:w="100" w:type="dxa"/>
+              <w:bottom w:w="100" w:type="dxa"/>
+              <w:left w:w="100" w:type="dxa"/>
+              <w:right w:w="100" w:type="dxa"/>
+            </w:tcMar>
+            <w:shd w:fill="F2F6FA"/>
+          </w:tcPr>
+          <w:p>
+            <w:pPr>
+              <w:spacing w:after="0" w:line="245" w:lineRule="auto"/>
+            </w:pPr>
+            <w:r>
+              <w:rPr>
+                <w:b w:val="0"/>
+                <w:color w:val="000000"/>
+                <w:sz w:val="16"/>
+              </w:rPr>
+              <w:t>Managed shared file storage; choose the service only after protocol and performance validation.</w:t>
+            </w:r>
+          </w:p>
+        </w:tc>
+      </w:tr>
+      <w:tr>
+        <w:trPr>
+          <w:cantSplit/>
+        </w:trPr>
+        <w:tc>
+          <w:tcPr>
+            <w:tcW w:type="dxa" w:w="2664"/>
+            <w:vAlign w:val="center"/>
+            <w:tcMar>
+              <w:top w:w="100" w:type="dxa"/>
+              <w:bottom w:w="100" w:type="dxa"/>
+              <w:left w:w="100" w:type="dxa"/>
+              <w:right w:w="100" w:type="dxa"/>
+            </w:tcMar>
+            <w:shd w:fill="FFFFFF"/>
+          </w:tcPr>
+          <w:p>
+            <w:pPr>
+              <w:spacing w:after="0" w:line="245" w:lineRule="auto"/>
+            </w:pPr>
+            <w:r>
+              <w:rPr>
+                <w:b w:val="0"/>
+                <w:color w:val="000000"/>
+                <w:sz w:val="16"/>
+              </w:rPr>
+              <w:t>Object Storage</w:t>
+            </w:r>
+          </w:p>
+        </w:tc>
+        <w:tc>
+          <w:tcPr>
+            <w:tcW w:type="dxa" w:w="2952"/>
+            <w:vAlign w:val="center"/>
+            <w:tcMar>
+              <w:top w:w="100" w:type="dxa"/>
+              <w:bottom w:w="100" w:type="dxa"/>
+              <w:left w:w="100" w:type="dxa"/>
+              <w:right w:w="100" w:type="dxa"/>
+            </w:tcMar>
+            <w:shd w:fill="FFFFFF"/>
+          </w:tcPr>
+          <w:p>
+            <w:pPr>
+              <w:spacing w:after="0" w:line="245" w:lineRule="auto"/>
+            </w:pPr>
+            <w:r>
+              <w:rPr>
+                <w:b w:val="0"/>
+                <w:color w:val="000000"/>
+                <w:sz w:val="16"/>
+              </w:rPr>
+              <w:t>Azure Blob Storage</w:t>
+            </w:r>
+          </w:p>
+        </w:tc>
+        <w:tc>
+          <w:tcPr>
+            <w:tcW w:type="dxa" w:w="4464"/>
+            <w:vAlign w:val="center"/>
+            <w:tcMar>
+              <w:top w:w="100" w:type="dxa"/>
+              <w:bottom w:w="100" w:type="dxa"/>
+              <w:left w:w="100" w:type="dxa"/>
+              <w:right w:w="100" w:type="dxa"/>
+            </w:tcMar>
+            <w:shd w:fill="FFFFFF"/>
+          </w:tcPr>
+          <w:p>
+            <w:pPr>
+              <w:spacing w:after="0" w:line="245" w:lineRule="auto"/>
+            </w:pPr>
+            <w:r>
+              <w:rPr>
+                <w:b w:val="0"/>
+                <w:color w:val="000000"/>
+                <w:sz w:val="16"/>
+              </w:rPr>
+              <w:t>Candidate controlled exchange point for Hyperscience output and DataWalk ingestion.</w:t>
+            </w:r>
+          </w:p>
+        </w:tc>
+      </w:tr>
+      <w:tr>
+        <w:trPr>
+          <w:cantSplit/>
+        </w:trPr>
+        <w:tc>
+          <w:tcPr>
+            <w:tcW w:type="dxa" w:w="2664"/>
+            <w:vAlign w:val="center"/>
+            <w:tcMar>
+              <w:top w:w="100" w:type="dxa"/>
+              <w:bottom w:w="100" w:type="dxa"/>
+              <w:left w:w="100" w:type="dxa"/>
+              <w:right w:w="100" w:type="dxa"/>
+            </w:tcMar>
+            <w:shd w:fill="F2F6FA"/>
+          </w:tcPr>
+          <w:p>
+            <w:pPr>
+              <w:spacing w:after="0" w:line="245" w:lineRule="auto"/>
+            </w:pPr>
+            <w:r>
+              <w:rPr>
+                <w:b w:val="0"/>
+                <w:color w:val="000000"/>
+                <w:sz w:val="16"/>
+              </w:rPr>
+              <w:t>Oracle Cloud Infrastructure Registry (OCIR)</w:t>
+            </w:r>
+          </w:p>
+        </w:tc>
+        <w:tc>
+          <w:tcPr>
+            <w:tcW w:type="dxa" w:w="2952"/>
+            <w:vAlign w:val="center"/>
+            <w:tcMar>
+              <w:top w:w="100" w:type="dxa"/>
+              <w:bottom w:w="100" w:type="dxa"/>
+              <w:left w:w="100" w:type="dxa"/>
+              <w:right w:w="100" w:type="dxa"/>
+            </w:tcMar>
+            <w:shd w:fill="F2F6FA"/>
+          </w:tcPr>
+          <w:p>
+            <w:pPr>
+              <w:spacing w:after="0" w:line="245" w:lineRule="auto"/>
+            </w:pPr>
+            <w:r>
+              <w:rPr>
+                <w:b w:val="0"/>
+                <w:color w:val="000000"/>
+                <w:sz w:val="16"/>
+              </w:rPr>
+              <w:t>Azure Container Registry (ACR)</w:t>
+            </w:r>
+          </w:p>
+        </w:tc>
+        <w:tc>
+          <w:tcPr>
+            <w:tcW w:type="dxa" w:w="4464"/>
+            <w:vAlign w:val="center"/>
+            <w:tcMar>
+              <w:top w:w="100" w:type="dxa"/>
+              <w:bottom w:w="100" w:type="dxa"/>
+              <w:left w:w="100" w:type="dxa"/>
+              <w:right w:w="100" w:type="dxa"/>
+            </w:tcMar>
+            <w:shd w:fill="F2F6FA"/>
+          </w:tcPr>
+          <w:p>
+            <w:pPr>
+              <w:spacing w:after="0" w:line="245" w:lineRule="auto"/>
+            </w:pPr>
+            <w:r>
+              <w:rPr>
+                <w:b w:val="0"/>
+                <w:color w:val="000000"/>
+                <w:sz w:val="16"/>
+              </w:rPr>
+              <w:t>Private registry for application and platform container images.</w:t>
+            </w:r>
+          </w:p>
+        </w:tc>
+      </w:tr>
+    </w:tbl>
+    <w:p>
+      <w:pPr>
+        <w:pStyle w:val="Heading2"/>
+      </w:pPr>
+      <w:r>
+        <w:t>Identity, Security and Operations</w:t>
+      </w:r>
+    </w:p>
+    <w:tbl>
+      <w:tblPr>
+        <w:tblW w:type="auto" w:w="0"/>
+        <w:jc w:val="center"/>
+        <w:tblLayout w:type="fixed"/>
+        <w:tblLook w:firstColumn="1" w:firstRow="1" w:lastColumn="0" w:lastRow="0" w:noHBand="0" w:noVBand="1" w:val="04A0"/>
+        <w:tblBorders>
+          <w:top w:val="single" w:sz="4" w:color="D9D9D9"/>
+          <w:left w:val="single" w:sz="4" w:color="D9D9D9"/>
+          <w:bottom w:val="single" w:sz="4" w:color="D9D9D9"/>
+          <w:right w:val="single" w:sz="4" w:color="D9D9D9"/>
+          <w:insideH w:val="single" w:sz="4" w:color="D9D9D9"/>
+          <w:insideV w:val="single" w:sz="4" w:color="D9D9D9"/>
+        </w:tblBorders>
+      </w:tblPr>
+      <w:tblGrid>
+        <w:gridCol w:w="2664"/>
+        <w:gridCol w:w="2952"/>
+        <w:gridCol w:w="4464"/>
+      </w:tblGrid>
+      <w:tr>
+        <w:trPr>
+          <w:cantSplit/>
+          <w:tblHeader/>
+        </w:trPr>
+        <w:tc>
+          <w:tcPr>
+            <w:tcW w:type="dxa" w:w="2664"/>
+            <w:vAlign w:val="center"/>
+            <w:tcMar>
+              <w:top w:w="100" w:type="dxa"/>
+              <w:bottom w:w="100" w:type="dxa"/>
+              <w:left w:w="100" w:type="dxa"/>
+              <w:right w:w="100" w:type="dxa"/>
+            </w:tcMar>
+            <w:shd w:fill="203864"/>
+          </w:tcPr>
+          <w:p>
+            <w:pPr>
+              <w:spacing w:after="0" w:line="245" w:lineRule="auto"/>
+            </w:pPr>
+            <w:r>
+              <w:rPr>
+                <w:b/>
+                <w:color w:val="FFFFFF"/>
+                <w:sz w:val="16"/>
+              </w:rPr>
+              <w:t>OCI term</w:t>
+            </w:r>
+          </w:p>
+        </w:tc>
+        <w:tc>
+          <w:tcPr>
+            <w:tcW w:type="dxa" w:w="2952"/>
+            <w:vAlign w:val="center"/>
+            <w:tcMar>
+              <w:top w:w="100" w:type="dxa"/>
+              <w:bottom w:w="100" w:type="dxa"/>
+              <w:left w:w="100" w:type="dxa"/>
+              <w:right w:w="100" w:type="dxa"/>
+            </w:tcMar>
+            <w:shd w:fill="203864"/>
+          </w:tcPr>
+          <w:p>
+            <w:pPr>
+              <w:spacing w:after="0" w:line="245" w:lineRule="auto"/>
+            </w:pPr>
+            <w:r>
+              <w:rPr>
+                <w:b/>
+                <w:color w:val="FFFFFF"/>
+                <w:sz w:val="16"/>
+              </w:rPr>
+              <w:t>Azure term</w:t>
+            </w:r>
+          </w:p>
+        </w:tc>
+        <w:tc>
+          <w:tcPr>
+            <w:tcW w:type="dxa" w:w="4464"/>
+            <w:vAlign w:val="center"/>
+            <w:tcMar>
+              <w:top w:w="100" w:type="dxa"/>
+              <w:bottom w:w="100" w:type="dxa"/>
+              <w:left w:w="100" w:type="dxa"/>
+              <w:right w:w="100" w:type="dxa"/>
+            </w:tcMar>
+            <w:shd w:fill="203864"/>
+          </w:tcPr>
+          <w:p>
+            <w:pPr>
+              <w:spacing w:after="0" w:line="245" w:lineRule="auto"/>
+            </w:pPr>
+            <w:r>
+              <w:rPr>
+                <w:b/>
+                <w:color w:val="FFFFFF"/>
+                <w:sz w:val="16"/>
+              </w:rPr>
+              <w:t>POC interpretation</w:t>
+            </w:r>
+          </w:p>
+        </w:tc>
+      </w:tr>
+      <w:tr>
+        <w:trPr>
+          <w:cantSplit/>
+        </w:trPr>
+        <w:tc>
+          <w:tcPr>
+            <w:tcW w:type="dxa" w:w="2664"/>
+            <w:vAlign w:val="center"/>
+            <w:tcMar>
+              <w:top w:w="100" w:type="dxa"/>
+              <w:bottom w:w="100" w:type="dxa"/>
+              <w:left w:w="100" w:type="dxa"/>
+              <w:right w:w="100" w:type="dxa"/>
+            </w:tcMar>
+            <w:shd w:fill="FFFFFF"/>
+          </w:tcPr>
+          <w:p>
+            <w:pPr>
+              <w:spacing w:after="0" w:line="245" w:lineRule="auto"/>
+            </w:pPr>
+            <w:r>
+              <w:rPr>
+                <w:b w:val="0"/>
+                <w:color w:val="000000"/>
+                <w:sz w:val="16"/>
+              </w:rPr>
+              <w:t>Identity domain / IAM</w:t>
+            </w:r>
+          </w:p>
+        </w:tc>
+        <w:tc>
+          <w:tcPr>
+            <w:tcW w:type="dxa" w:w="2952"/>
+            <w:vAlign w:val="center"/>
+            <w:tcMar>
+              <w:top w:w="100" w:type="dxa"/>
+              <w:bottom w:w="100" w:type="dxa"/>
+              <w:left w:w="100" w:type="dxa"/>
+              <w:right w:w="100" w:type="dxa"/>
+            </w:tcMar>
+            <w:shd w:fill="FFFFFF"/>
+          </w:tcPr>
+          <w:p>
+            <w:pPr>
+              <w:spacing w:after="0" w:line="245" w:lineRule="auto"/>
+            </w:pPr>
+            <w:r>
+              <w:rPr>
+                <w:b w:val="0"/>
+                <w:color w:val="000000"/>
+                <w:sz w:val="16"/>
+              </w:rPr>
+              <w:t>Microsoft Entra ID</w:t>
+            </w:r>
+          </w:p>
+        </w:tc>
+        <w:tc>
+          <w:tcPr>
+            <w:tcW w:type="dxa" w:w="4464"/>
+            <w:vAlign w:val="center"/>
+            <w:tcMar>
+              <w:top w:w="100" w:type="dxa"/>
+              <w:bottom w:w="100" w:type="dxa"/>
+              <w:left w:w="100" w:type="dxa"/>
+              <w:right w:w="100" w:type="dxa"/>
+            </w:tcMar>
+            <w:shd w:fill="FFFFFF"/>
+          </w:tcPr>
+          <w:p>
+            <w:pPr>
+              <w:spacing w:after="0" w:line="245" w:lineRule="auto"/>
+            </w:pPr>
+            <w:r>
+              <w:rPr>
+                <w:b w:val="0"/>
+                <w:color w:val="000000"/>
+                <w:sz w:val="16"/>
+              </w:rPr>
+              <w:t>Workforce and workload identity foundation.</w:t>
+            </w:r>
+          </w:p>
+        </w:tc>
+      </w:tr>
+      <w:tr>
+        <w:trPr>
+          <w:cantSplit/>
+        </w:trPr>
+        <w:tc>
+          <w:tcPr>
+            <w:tcW w:type="dxa" w:w="2664"/>
+            <w:vAlign w:val="center"/>
+            <w:tcMar>
+              <w:top w:w="100" w:type="dxa"/>
+              <w:bottom w:w="100" w:type="dxa"/>
+              <w:left w:w="100" w:type="dxa"/>
+              <w:right w:w="100" w:type="dxa"/>
+            </w:tcMar>
+            <w:shd w:fill="F2F6FA"/>
+          </w:tcPr>
+          <w:p>
+            <w:pPr>
+              <w:spacing w:after="0" w:line="245" w:lineRule="auto"/>
+            </w:pPr>
+            <w:r>
+              <w:rPr>
+                <w:b w:val="0"/>
+                <w:color w:val="000000"/>
+                <w:sz w:val="16"/>
+              </w:rPr>
+              <w:t>IAM policy</w:t>
+            </w:r>
+          </w:p>
+        </w:tc>
+        <w:tc>
+          <w:tcPr>
+            <w:tcW w:type="dxa" w:w="2952"/>
+            <w:vAlign w:val="center"/>
+            <w:tcMar>
+              <w:top w:w="100" w:type="dxa"/>
+              <w:bottom w:w="100" w:type="dxa"/>
+              <w:left w:w="100" w:type="dxa"/>
+              <w:right w:w="100" w:type="dxa"/>
+            </w:tcMar>
+            <w:shd w:fill="F2F6FA"/>
+          </w:tcPr>
+          <w:p>
+            <w:pPr>
+              <w:spacing w:after="0" w:line="245" w:lineRule="auto"/>
+            </w:pPr>
+            <w:r>
+              <w:rPr>
+                <w:b w:val="0"/>
+                <w:color w:val="000000"/>
+                <w:sz w:val="16"/>
+              </w:rPr>
+              <w:t>Azure RBAC plus Azure Policy</w:t>
+            </w:r>
+          </w:p>
+        </w:tc>
+        <w:tc>
+          <w:tcPr>
+            <w:tcW w:type="dxa" w:w="4464"/>
+            <w:vAlign w:val="center"/>
+            <w:tcMar>
+              <w:top w:w="100" w:type="dxa"/>
+              <w:bottom w:w="100" w:type="dxa"/>
+              <w:left w:w="100" w:type="dxa"/>
+              <w:right w:w="100" w:type="dxa"/>
+            </w:tcMar>
+            <w:shd w:fill="F2F6FA"/>
+          </w:tcPr>
+          <w:p>
+            <w:pPr>
+              <w:spacing w:after="0" w:line="245" w:lineRule="auto"/>
+            </w:pPr>
+            <w:r>
+              <w:rPr>
+                <w:b w:val="0"/>
+                <w:color w:val="000000"/>
+                <w:sz w:val="16"/>
+              </w:rPr>
+              <w:t>Approximate. RBAC grants access; Azure Policy enforces or audits resource configuration.</w:t>
+            </w:r>
+          </w:p>
+        </w:tc>
+      </w:tr>
+      <w:tr>
+        <w:trPr>
+          <w:cantSplit/>
+        </w:trPr>
+        <w:tc>
+          <w:tcPr>
+            <w:tcW w:type="dxa" w:w="2664"/>
+            <w:vAlign w:val="center"/>
+            <w:tcMar>
+              <w:top w:w="100" w:type="dxa"/>
+              <w:bottom w:w="100" w:type="dxa"/>
+              <w:left w:w="100" w:type="dxa"/>
+              <w:right w:w="100" w:type="dxa"/>
+            </w:tcMar>
+            <w:shd w:fill="FFFFFF"/>
+          </w:tcPr>
+          <w:p>
+            <w:pPr>
+              <w:spacing w:after="0" w:line="245" w:lineRule="auto"/>
+            </w:pPr>
+            <w:r>
+              <w:rPr>
+                <w:b w:val="0"/>
+                <w:color w:val="000000"/>
+                <w:sz w:val="16"/>
+              </w:rPr>
+              <w:t>Vault</w:t>
+            </w:r>
+          </w:p>
+        </w:tc>
+        <w:tc>
+          <w:tcPr>
+            <w:tcW w:type="dxa" w:w="2952"/>
+            <w:vAlign w:val="center"/>
+            <w:tcMar>
+              <w:top w:w="100" w:type="dxa"/>
+              <w:bottom w:w="100" w:type="dxa"/>
+              <w:left w:w="100" w:type="dxa"/>
+              <w:right w:w="100" w:type="dxa"/>
+            </w:tcMar>
+            <w:shd w:fill="FFFFFF"/>
+          </w:tcPr>
+          <w:p>
+            <w:pPr>
+              <w:spacing w:after="0" w:line="245" w:lineRule="auto"/>
+            </w:pPr>
+            <w:r>
+              <w:rPr>
+                <w:b w:val="0"/>
+                <w:color w:val="000000"/>
+                <w:sz w:val="16"/>
+              </w:rPr>
+              <w:t>Azure Key Vault</w:t>
+            </w:r>
+          </w:p>
+        </w:tc>
+        <w:tc>
+          <w:tcPr>
+            <w:tcW w:type="dxa" w:w="4464"/>
+            <w:vAlign w:val="center"/>
+            <w:tcMar>
+              <w:top w:w="100" w:type="dxa"/>
+              <w:bottom w:w="100" w:type="dxa"/>
+              <w:left w:w="100" w:type="dxa"/>
+              <w:right w:w="100" w:type="dxa"/>
+            </w:tcMar>
+            <w:shd w:fill="FFFFFF"/>
+          </w:tcPr>
+          <w:p>
+            <w:pPr>
+              <w:spacing w:after="0" w:line="245" w:lineRule="auto"/>
+            </w:pPr>
+            <w:r>
+              <w:rPr>
+                <w:b w:val="0"/>
+                <w:color w:val="000000"/>
+                <w:sz w:val="16"/>
+              </w:rPr>
+              <w:t>Store secrets, keys and certificates outside application configuration.</w:t>
+            </w:r>
+          </w:p>
+        </w:tc>
+      </w:tr>
+      <w:tr>
+        <w:trPr>
+          <w:cantSplit/>
+        </w:trPr>
+        <w:tc>
+          <w:tcPr>
+            <w:tcW w:type="dxa" w:w="2664"/>
+            <w:vAlign w:val="center"/>
+            <w:tcMar>
+              <w:top w:w="100" w:type="dxa"/>
+              <w:bottom w:w="100" w:type="dxa"/>
+              <w:left w:w="100" w:type="dxa"/>
+              <w:right w:w="100" w:type="dxa"/>
+            </w:tcMar>
+            <w:shd w:fill="F2F6FA"/>
+          </w:tcPr>
+          <w:p>
+            <w:pPr>
+              <w:spacing w:after="0" w:line="245" w:lineRule="auto"/>
+            </w:pPr>
+            <w:r>
+              <w:rPr>
+                <w:b w:val="0"/>
+                <w:color w:val="000000"/>
+                <w:sz w:val="16"/>
+              </w:rPr>
+              <w:t>Cloud Guard</w:t>
+            </w:r>
+          </w:p>
+        </w:tc>
+        <w:tc>
+          <w:tcPr>
+            <w:tcW w:type="dxa" w:w="2952"/>
+            <w:vAlign w:val="center"/>
+            <w:tcMar>
+              <w:top w:w="100" w:type="dxa"/>
+              <w:bottom w:w="100" w:type="dxa"/>
+              <w:left w:w="100" w:type="dxa"/>
+              <w:right w:w="100" w:type="dxa"/>
+            </w:tcMar>
+            <w:shd w:fill="F2F6FA"/>
+          </w:tcPr>
+          <w:p>
+            <w:pPr>
+              <w:spacing w:after="0" w:line="245" w:lineRule="auto"/>
+            </w:pPr>
+            <w:r>
+              <w:rPr>
+                <w:b w:val="0"/>
+                <w:color w:val="000000"/>
+                <w:sz w:val="16"/>
+              </w:rPr>
+              <w:t>Microsoft Defender for Cloud</w:t>
+            </w:r>
+          </w:p>
+        </w:tc>
+        <w:tc>
+          <w:tcPr>
+            <w:tcW w:type="dxa" w:w="4464"/>
+            <w:vAlign w:val="center"/>
+            <w:tcMar>
+              <w:top w:w="100" w:type="dxa"/>
+              <w:bottom w:w="100" w:type="dxa"/>
+              <w:left w:w="100" w:type="dxa"/>
+              <w:right w:w="100" w:type="dxa"/>
+            </w:tcMar>
+            <w:shd w:fill="F2F6FA"/>
+          </w:tcPr>
+          <w:p>
+            <w:pPr>
+              <w:spacing w:after="0" w:line="245" w:lineRule="auto"/>
+            </w:pPr>
+            <w:r>
+              <w:rPr>
+                <w:b w:val="0"/>
+                <w:color w:val="000000"/>
+                <w:sz w:val="16"/>
+              </w:rPr>
+              <w:t>Cloud security posture, recommendations and workload protection capabilities.</w:t>
+            </w:r>
+          </w:p>
+        </w:tc>
+      </w:tr>
+      <w:tr>
+        <w:trPr>
+          <w:cantSplit/>
+        </w:trPr>
+        <w:tc>
+          <w:tcPr>
+            <w:tcW w:type="dxa" w:w="2664"/>
+            <w:vAlign w:val="center"/>
+            <w:tcMar>
+              <w:top w:w="100" w:type="dxa"/>
+              <w:bottom w:w="100" w:type="dxa"/>
+              <w:left w:w="100" w:type="dxa"/>
+              <w:right w:w="100" w:type="dxa"/>
+            </w:tcMar>
+            <w:shd w:fill="FFFFFF"/>
+          </w:tcPr>
+          <w:p>
+            <w:pPr>
+              <w:spacing w:after="0" w:line="245" w:lineRule="auto"/>
+            </w:pPr>
+            <w:r>
+              <w:rPr>
+                <w:b w:val="0"/>
+                <w:color w:val="000000"/>
+                <w:sz w:val="16"/>
+              </w:rPr>
+              <w:t>Security Zones</w:t>
+            </w:r>
+          </w:p>
+        </w:tc>
+        <w:tc>
+          <w:tcPr>
+            <w:tcW w:type="dxa" w:w="2952"/>
+            <w:vAlign w:val="center"/>
+            <w:tcMar>
+              <w:top w:w="100" w:type="dxa"/>
+              <w:bottom w:w="100" w:type="dxa"/>
+              <w:left w:w="100" w:type="dxa"/>
+              <w:right w:w="100" w:type="dxa"/>
+            </w:tcMar>
+            <w:shd w:fill="FFFFFF"/>
+          </w:tcPr>
+          <w:p>
+            <w:pPr>
+              <w:spacing w:after="0" w:line="245" w:lineRule="auto"/>
+            </w:pPr>
+            <w:r>
+              <w:rPr>
+                <w:b w:val="0"/>
+                <w:color w:val="000000"/>
+                <w:sz w:val="16"/>
+              </w:rPr>
+              <w:t>Azure Policy initiatives and landing-zone guardrails</w:t>
+            </w:r>
+          </w:p>
+        </w:tc>
+        <w:tc>
+          <w:tcPr>
+            <w:tcW w:type="dxa" w:w="4464"/>
+            <w:vAlign w:val="center"/>
+            <w:tcMar>
+              <w:top w:w="100" w:type="dxa"/>
+              <w:bottom w:w="100" w:type="dxa"/>
+              <w:left w:w="100" w:type="dxa"/>
+              <w:right w:w="100" w:type="dxa"/>
+            </w:tcMar>
+            <w:shd w:fill="FFFFFF"/>
+          </w:tcPr>
+          <w:p>
+            <w:pPr>
+              <w:spacing w:after="0" w:line="245" w:lineRule="auto"/>
+            </w:pPr>
+            <w:r>
+              <w:rPr>
+                <w:b w:val="0"/>
+                <w:color w:val="000000"/>
+                <w:sz w:val="16"/>
+              </w:rPr>
+              <w:t>Approximate. Enforce approved configurations at management-group, subscription or resource-group scope.</w:t>
+            </w:r>
+          </w:p>
+        </w:tc>
+      </w:tr>
+      <w:tr>
+        <w:trPr>
+          <w:cantSplit/>
+        </w:trPr>
+        <w:tc>
+          <w:tcPr>
+            <w:tcW w:type="dxa" w:w="2664"/>
+            <w:vAlign w:val="center"/>
+            <w:tcMar>
+              <w:top w:w="100" w:type="dxa"/>
+              <w:bottom w:w="100" w:type="dxa"/>
+              <w:left w:w="100" w:type="dxa"/>
+              <w:right w:w="100" w:type="dxa"/>
+            </w:tcMar>
+            <w:shd w:fill="F2F6FA"/>
+          </w:tcPr>
+          <w:p>
+            <w:pPr>
+              <w:spacing w:after="0" w:line="245" w:lineRule="auto"/>
+            </w:pPr>
+            <w:r>
+              <w:rPr>
+                <w:b w:val="0"/>
+                <w:color w:val="000000"/>
+                <w:sz w:val="16"/>
+              </w:rPr>
+              <w:t>Logging / Monitoring</w:t>
+            </w:r>
+          </w:p>
+        </w:tc>
+        <w:tc>
+          <w:tcPr>
+            <w:tcW w:type="dxa" w:w="2952"/>
+            <w:vAlign w:val="center"/>
+            <w:tcMar>
+              <w:top w:w="100" w:type="dxa"/>
+              <w:bottom w:w="100" w:type="dxa"/>
+              <w:left w:w="100" w:type="dxa"/>
+              <w:right w:w="100" w:type="dxa"/>
+            </w:tcMar>
+            <w:shd w:fill="F2F6FA"/>
+          </w:tcPr>
+          <w:p>
+            <w:pPr>
+              <w:spacing w:after="0" w:line="245" w:lineRule="auto"/>
+            </w:pPr>
+            <w:r>
+              <w:rPr>
+                <w:b w:val="0"/>
+                <w:color w:val="000000"/>
+                <w:sz w:val="16"/>
+              </w:rPr>
+              <w:t>Azure Monitor and Log Analytics</w:t>
+            </w:r>
+          </w:p>
+        </w:tc>
+        <w:tc>
+          <w:tcPr>
+            <w:tcW w:type="dxa" w:w="4464"/>
+            <w:vAlign w:val="center"/>
+            <w:tcMar>
+              <w:top w:w="100" w:type="dxa"/>
+              <w:bottom w:w="100" w:type="dxa"/>
+              <w:left w:w="100" w:type="dxa"/>
+              <w:right w:w="100" w:type="dxa"/>
+            </w:tcMar>
+            <w:shd w:fill="F2F6FA"/>
+          </w:tcPr>
+          <w:p>
+            <w:pPr>
+              <w:spacing w:after="0" w:line="245" w:lineRule="auto"/>
+            </w:pPr>
+            <w:r>
+              <w:rPr>
+                <w:b w:val="0"/>
+                <w:color w:val="000000"/>
+                <w:sz w:val="16"/>
+              </w:rPr>
+              <w:t>Central platform metrics, logs, queries, dashboards and alerts.</w:t>
+            </w:r>
+          </w:p>
+        </w:tc>
+      </w:tr>
+      <w:tr>
+        <w:trPr>
+          <w:cantSplit/>
+        </w:trPr>
+        <w:tc>
+          <w:tcPr>
+            <w:tcW w:type="dxa" w:w="2664"/>
+            <w:vAlign w:val="center"/>
+            <w:tcMar>
+              <w:top w:w="100" w:type="dxa"/>
+              <w:bottom w:w="100" w:type="dxa"/>
+              <w:left w:w="100" w:type="dxa"/>
+              <w:right w:w="100" w:type="dxa"/>
+            </w:tcMar>
+            <w:shd w:fill="FFFFFF"/>
+          </w:tcPr>
+          <w:p>
+            <w:pPr>
+              <w:spacing w:after="0" w:line="245" w:lineRule="auto"/>
+            </w:pPr>
+            <w:r>
+              <w:rPr>
+                <w:b w:val="0"/>
+                <w:color w:val="000000"/>
+                <w:sz w:val="16"/>
+              </w:rPr>
+              <w:t>VCN Flow Logs</w:t>
+            </w:r>
+          </w:p>
+        </w:tc>
+        <w:tc>
+          <w:tcPr>
+            <w:tcW w:type="dxa" w:w="2952"/>
+            <w:vAlign w:val="center"/>
+            <w:tcMar>
+              <w:top w:w="100" w:type="dxa"/>
+              <w:bottom w:w="100" w:type="dxa"/>
+              <w:left w:w="100" w:type="dxa"/>
+              <w:right w:w="100" w:type="dxa"/>
+            </w:tcMar>
+            <w:shd w:fill="FFFFFF"/>
+          </w:tcPr>
+          <w:p>
+            <w:pPr>
+              <w:spacing w:after="0" w:line="245" w:lineRule="auto"/>
+            </w:pPr>
+            <w:r>
+              <w:rPr>
+                <w:b w:val="0"/>
+                <w:color w:val="000000"/>
+                <w:sz w:val="16"/>
+              </w:rPr>
+              <w:t>Virtual Network Flow Logs</w:t>
+            </w:r>
+          </w:p>
+        </w:tc>
+        <w:tc>
+          <w:tcPr>
+            <w:tcW w:type="dxa" w:w="4464"/>
+            <w:vAlign w:val="center"/>
+            <w:tcMar>
+              <w:top w:w="100" w:type="dxa"/>
+              <w:bottom w:w="100" w:type="dxa"/>
+              <w:left w:w="100" w:type="dxa"/>
+              <w:right w:w="100" w:type="dxa"/>
+            </w:tcMar>
+            <w:shd w:fill="FFFFFF"/>
+          </w:tcPr>
+          <w:p>
+            <w:pPr>
+              <w:spacing w:after="0" w:line="245" w:lineRule="auto"/>
+            </w:pPr>
+            <w:r>
+              <w:rPr>
+                <w:b w:val="0"/>
+                <w:color w:val="000000"/>
+                <w:sz w:val="16"/>
+              </w:rPr>
+              <w:t>Network-flow evidence for troubleshooting and security analysis.</w:t>
+            </w:r>
+          </w:p>
+        </w:tc>
+      </w:tr>
+      <w:tr>
+        <w:trPr>
+          <w:cantSplit/>
+        </w:trPr>
+        <w:tc>
+          <w:tcPr>
+            <w:tcW w:type="dxa" w:w="2664"/>
+            <w:vAlign w:val="center"/>
+            <w:tcMar>
+              <w:top w:w="100" w:type="dxa"/>
+              <w:bottom w:w="100" w:type="dxa"/>
+              <w:left w:w="100" w:type="dxa"/>
+              <w:right w:w="100" w:type="dxa"/>
+            </w:tcMar>
+            <w:shd w:fill="F2F6FA"/>
+          </w:tcPr>
+          <w:p>
+            <w:pPr>
+              <w:spacing w:after="0" w:line="245" w:lineRule="auto"/>
+            </w:pPr>
+            <w:r>
+              <w:rPr>
+                <w:b w:val="0"/>
+                <w:color w:val="000000"/>
+                <w:sz w:val="16"/>
+              </w:rPr>
+              <w:t>Resource Manager (ORM)</w:t>
+            </w:r>
+          </w:p>
+        </w:tc>
+        <w:tc>
+          <w:tcPr>
+            <w:tcW w:type="dxa" w:w="2952"/>
+            <w:vAlign w:val="center"/>
+            <w:tcMar>
+              <w:top w:w="100" w:type="dxa"/>
+              <w:bottom w:w="100" w:type="dxa"/>
+              <w:left w:w="100" w:type="dxa"/>
+              <w:right w:w="100" w:type="dxa"/>
+            </w:tcMar>
+            <w:shd w:fill="F2F6FA"/>
+          </w:tcPr>
+          <w:p>
+            <w:pPr>
+              <w:spacing w:after="0" w:line="245" w:lineRule="auto"/>
+            </w:pPr>
+            <w:r>
+              <w:rPr>
+                <w:b w:val="0"/>
+                <w:color w:val="000000"/>
+                <w:sz w:val="16"/>
+              </w:rPr>
+              <w:t>Azure Resource Manager/Bicep or Terraform pipeline</w:t>
+            </w:r>
+          </w:p>
+        </w:tc>
+        <w:tc>
+          <w:tcPr>
+            <w:tcW w:type="dxa" w:w="4464"/>
+            <w:vAlign w:val="center"/>
+            <w:tcMar>
+              <w:top w:w="100" w:type="dxa"/>
+              <w:bottom w:w="100" w:type="dxa"/>
+              <w:left w:w="100" w:type="dxa"/>
+              <w:right w:w="100" w:type="dxa"/>
+            </w:tcMar>
+            <w:shd w:fill="F2F6FA"/>
+          </w:tcPr>
+          <w:p>
+            <w:pPr>
+              <w:spacing w:after="0" w:line="245" w:lineRule="auto"/>
+            </w:pPr>
+            <w:r>
+              <w:rPr>
+                <w:b w:val="0"/>
+                <w:color w:val="000000"/>
+                <w:sz w:val="16"/>
+              </w:rPr>
+              <w:t>No exact managed-Terraform equivalent. This POC will use Terraform with an approved delivery pipeline.</w:t>
+            </w:r>
+          </w:p>
+        </w:tc>
+      </w:tr>
+    </w:tbl>
+    <w:p>
+      <w:r>
+        <w:br w:type="page"/>
       </w:r>
     </w:p>
     <w:p>
@@ -4499,8 +7185,50 @@
         </w:r>
       </w:hyperlink>
     </w:p>
+    <w:p>
+      <w:pPr>
+        <w:spacing w:after="40"/>
+      </w:pPr>
+      <w:hyperlink r:id="rId12">
+        <w:r>
+          <w:rPr>
+            <w:color w:val="1D4E79"/>
+            <w:sz w:val="18"/>
+          </w:rPr>
+          <w:t>Azure ExpressRoute overview</w:t>
+        </w:r>
+      </w:hyperlink>
+    </w:p>
+    <w:p>
+      <w:pPr>
+        <w:spacing w:after="40"/>
+      </w:pPr>
+      <w:hyperlink r:id="rId13">
+        <w:r>
+          <w:rPr>
+            <w:color w:val="1D4E79"/>
+            <w:sz w:val="18"/>
+          </w:rPr>
+          <w:t>OCI FastConnect overview</w:t>
+        </w:r>
+      </w:hyperlink>
+    </w:p>
+    <w:p>
+      <w:pPr>
+        <w:spacing w:after="40"/>
+      </w:pPr>
+      <w:hyperlink r:id="rId14">
+        <w:r>
+          <w:rPr>
+            <w:color w:val="1D4E79"/>
+            <w:sz w:val="18"/>
+          </w:rPr>
+          <w:t>Azure networking services overview</w:t>
+        </w:r>
+      </w:hyperlink>
+    </w:p>
     <w:sectPr>
-      <w:footerReference w:type="default" r:id="rId12"/>
+      <w:footerReference w:type="default" r:id="rId15"/>
       <w:pgSz w:w="12240" w:h="15840"/>
       <w:pgMar w:top="936" w:right="1008" w:bottom="936" w:left="1008" w:header="720" w:footer="720" w:gutter="0"/>
       <w:cols w:space="720"/>

</xml_diff>